<commit_message>
addressed policy Qs Nov 2025
</commit_message>
<xml_diff>
--- a/figures/sensitivity_out/Sensitivity analysis.docx
+++ b/figures/sensitivity_out/Sensitivity analysis.docx
@@ -1,66 +1,362 @@
 
 <file path=word/document.xml><?xml version="1.0" encoding="utf-8"?>
-<w:document xmlns:wpc="http://schemas.microsoft.com/office/word/2010/wordprocessingCanvas" xmlns:cx="http://schemas.microsoft.com/office/drawing/2014/chartex" xmlns:cx1="http://schemas.microsoft.com/office/drawing/2015/9/8/chartex" xmlns:cx2="http://schemas.microsoft.com/office/drawing/2015/10/21/chartex" xmlns:cx3="http://schemas.microsoft.com/office/drawing/2016/5/9/chartex" xmlns:cx4="http://schemas.microsoft.com/office/drawing/2016/5/10/chartex" xmlns:cx5="http://schemas.microsoft.com/office/drawing/2016/5/11/chartex" xmlns:cx6="http://schemas.microsoft.com/office/drawing/2016/5/12/chartex" xmlns:cx7="http://schemas.microsoft.com/office/drawing/2016/5/13/chartex" xmlns:cx8="http://schemas.microsoft.com/office/drawing/2016/5/14/chartex" xmlns:mc="http://schemas.openxmlformats.org/markup-compatibility/2006" xmlns:aink="http://schemas.microsoft.com/office/drawing/2016/ink" xmlns:am3d="http://schemas.microsoft.com/office/drawing/2017/model3d" xmlns:o="urn:schemas-microsoft-com:office:office" xmlns:oel="http://schemas.microsoft.com/office/2019/extlst" xmlns:r="http://schemas.openxmlformats.org/officeDocument/2006/relationships" xmlns:m="http://schemas.openxmlformats.org/officeDocument/2006/math" xmlns:v="urn:schemas-microsoft-com:vml" xmlns:wp14="http://schemas.microsoft.com/office/word/2010/wordprocessingDrawing" xmlns:wp="http://schemas.openxmlformats.org/drawingml/2006/wordprocessingDrawing" xmlns:w10="urn:schemas-microsoft-com:office:word" xmlns:w="http://schemas.openxmlformats.org/wordprocessingml/2006/main" xmlns:w14="http://schemas.microsoft.com/office/word/2010/wordml" xmlns:w15="http://schemas.microsoft.com/office/word/2012/wordml" xmlns:w16cex="http://schemas.microsoft.com/office/word/2018/wordml/cex" xmlns:w16cid="http://schemas.microsoft.com/office/word/2016/wordml/cid" xmlns:w16="http://schemas.microsoft.com/office/word/2018/wordml" xmlns:w16sdtdh="http://schemas.microsoft.com/office/word/2020/wordml/sdtdatahash" xmlns:w16se="http://schemas.microsoft.com/office/word/2015/wordml/symex" xmlns:wpg="http://schemas.microsoft.com/office/word/2010/wordprocessingGroup" xmlns:wpi="http://schemas.microsoft.com/office/word/2010/wordprocessingInk" xmlns:wne="http://schemas.microsoft.com/office/word/2006/wordml" xmlns:wps="http://schemas.microsoft.com/office/word/2010/wordprocessingShape" mc:Ignorable="w14 w15 w16se w16cid w16 w16cex w16sdtdh wp14">
+<w:document xmlns:wpc="http://schemas.microsoft.com/office/word/2010/wordprocessingCanvas" xmlns:cx="http://schemas.microsoft.com/office/drawing/2014/chartex" xmlns:cx1="http://schemas.microsoft.com/office/drawing/2015/9/8/chartex" xmlns:cx2="http://schemas.microsoft.com/office/drawing/2015/10/21/chartex" xmlns:cx3="http://schemas.microsoft.com/office/drawing/2016/5/9/chartex" xmlns:cx4="http://schemas.microsoft.com/office/drawing/2016/5/10/chartex" xmlns:cx5="http://schemas.microsoft.com/office/drawing/2016/5/11/chartex" xmlns:cx6="http://schemas.microsoft.com/office/drawing/2016/5/12/chartex" xmlns:cx7="http://schemas.microsoft.com/office/drawing/2016/5/13/chartex" xmlns:cx8="http://schemas.microsoft.com/office/drawing/2016/5/14/chartex" xmlns:mc="http://schemas.openxmlformats.org/markup-compatibility/2006" xmlns:aink="http://schemas.microsoft.com/office/drawing/2016/ink" xmlns:am3d="http://schemas.microsoft.com/office/drawing/2017/model3d" xmlns:o="urn:schemas-microsoft-com:office:office" xmlns:oel="http://schemas.microsoft.com/office/2019/extlst" xmlns:r="http://schemas.openxmlformats.org/officeDocument/2006/relationships" xmlns:m="http://schemas.openxmlformats.org/officeDocument/2006/math" xmlns:v="urn:schemas-microsoft-com:vml" xmlns:wp14="http://schemas.microsoft.com/office/word/2010/wordprocessingDrawing" xmlns:wp="http://schemas.openxmlformats.org/drawingml/2006/wordprocessingDrawing" xmlns:w10="urn:schemas-microsoft-com:office:word" xmlns:w="http://schemas.openxmlformats.org/wordprocessingml/2006/main" xmlns:w14="http://schemas.microsoft.com/office/word/2010/wordml" xmlns:w15="http://schemas.microsoft.com/office/word/2012/wordml" xmlns:w16cex="http://schemas.microsoft.com/office/word/2018/wordml/cex" xmlns:w16cid="http://schemas.microsoft.com/office/word/2016/wordml/cid" xmlns:w16="http://schemas.microsoft.com/office/word/2018/wordml" xmlns:w16du="http://schemas.microsoft.com/office/word/2023/wordml/word16du" xmlns:w16sdtdh="http://schemas.microsoft.com/office/word/2020/wordml/sdtdatahash" xmlns:w16sdtfl="http://schemas.microsoft.com/office/word/2024/wordml/sdtformatlock" xmlns:w16se="http://schemas.microsoft.com/office/word/2015/wordml/symex" xmlns:wpg="http://schemas.microsoft.com/office/word/2010/wordprocessingGroup" xmlns:wpi="http://schemas.microsoft.com/office/word/2010/wordprocessingInk" xmlns:wne="http://schemas.microsoft.com/office/word/2006/wordml" xmlns:wps="http://schemas.microsoft.com/office/word/2010/wordprocessingShape" mc:Ignorable="w14 w15 w16se w16cid w16 w16cex w16sdtdh w16sdtfl w16du wp14">
   <w:body>
     <w:p>
       <w:pPr>
-        <w:spacing w:before="100" w:beforeAutospacing="1" w:after="100" w:afterAutospacing="1"/>
-        <w:rPr>
-          <w:rFonts w:ascii="Times New Roman" w:eastAsia="Times New Roman" w:hAnsi="Times New Roman" w:cs="Times New Roman"/>
-          <w:kern w:val="0"/>
-          <w:lang w:eastAsia="en-GB"/>
-          <w14:ligatures w14:val="none"/>
-        </w:rPr>
-      </w:pPr>
-      <w:r>
-        <w:rPr>
-          <w:rFonts w:ascii="Times New Roman" w:eastAsia="Times New Roman" w:hAnsi="Times New Roman" w:cs="Times New Roman"/>
-          <w:kern w:val="0"/>
-          <w:lang w:eastAsia="en-GB"/>
-          <w14:ligatures w14:val="none"/>
-        </w:rPr>
-        <w:t xml:space="preserve">Here, I run sensitivity analysis of parameters such as MDV, HDR, and health seeking ( pSeek, pStart and pComplete). Unless otherwise specified, this is a single parameter at a time ie by holding all other parameters constant and explore a range of the parameter of interest eg., MDV (0-100%); HDR (1-500); and pSeek, pStart and pComplete (0-1). </w:t>
-      </w:r>
-    </w:p>
-    <w:p>
-      <w:pPr>
-        <w:spacing w:before="100" w:beforeAutospacing="1" w:after="100" w:afterAutospacing="1"/>
-        <w:outlineLvl w:val="1"/>
-        <w:rPr>
-          <w:rFonts w:ascii="Times New Roman" w:eastAsia="Times New Roman" w:hAnsi="Times New Roman" w:cs="Times New Roman"/>
+        <w:pStyle w:val="Heading1"/>
+      </w:pPr>
+      <w:r>
+        <w:t>Sensitivity Analysis</w:t>
+      </w:r>
+    </w:p>
+    <w:p>
+      <w:pPr>
+        <w:pStyle w:val="NormalWeb"/>
+      </w:pPr>
+      <w:r>
+        <w:t xml:space="preserve">This analysis explores the </w:t>
+      </w:r>
+      <w:r>
+        <w:rPr>
+          <w:rStyle w:val="Strong"/>
+        </w:rPr>
+        <w:t>sensitivity of key parameters</w:t>
+      </w:r>
+      <w:r>
+        <w:t xml:space="preserve"> affecting rabies epidemiology, including </w:t>
+      </w:r>
+      <w:r>
+        <w:rPr>
+          <w:rStyle w:val="Strong"/>
+        </w:rPr>
+        <w:t>Mass Dog Vaccination (MDV), Human-Dog Ratio (HDR), and health-seeking behavio</w:t>
+      </w:r>
+      <w:r>
+        <w:rPr>
+          <w:rStyle w:val="Strong"/>
+        </w:rPr>
+        <w:t>u</w:t>
+      </w:r>
+      <w:r>
+        <w:rPr>
+          <w:rStyle w:val="Strong"/>
+        </w:rPr>
+        <w:t>r</w:t>
+      </w:r>
+      <w:r>
+        <w:t xml:space="preserve"> (</w:t>
+      </w:r>
+      <w:r>
+        <w:rPr>
+          <w:rStyle w:val="Strong"/>
+        </w:rPr>
+        <w:t>pSeek, pStart, and pComplete</w:t>
+      </w:r>
+      <w:r>
+        <w:t>).</w:t>
+      </w:r>
+      <w:r>
+        <w:t xml:space="preserve"> </w:t>
+      </w:r>
+      <w:r>
+        <w:t>Unless otherwise specified</w:t>
+      </w:r>
+      <w:r>
+        <w:t xml:space="preserve"> (eg a combination of MDV and HDR)</w:t>
+      </w:r>
+      <w:r>
+        <w:t xml:space="preserve">, each parameter is analyzed </w:t>
+      </w:r>
+      <w:r>
+        <w:rPr>
+          <w:rStyle w:val="Strong"/>
+        </w:rPr>
+        <w:t>independently</w:t>
+      </w:r>
+      <w:r>
+        <w:t xml:space="preserve">, meaning all other parameters are held constant while the parameter of interest is varied. For example, </w:t>
+      </w:r>
+      <w:r>
+        <w:rPr>
+          <w:rStyle w:val="Strong"/>
+        </w:rPr>
+        <w:t>MDV coverage is explored across a range of 0% to 100%</w:t>
+      </w:r>
+      <w:r>
+        <w:t>.</w:t>
+      </w:r>
+    </w:p>
+    <w:p>
+      <w:pPr>
+        <w:pStyle w:val="NormalWeb"/>
+      </w:pPr>
+      <w:r>
+        <w:t xml:space="preserve">All plots present the </w:t>
+      </w:r>
+      <w:r>
+        <w:rPr>
+          <w:rStyle w:val="Strong"/>
+        </w:rPr>
+        <w:t>median values with 95% confidence intervals (CI)</w:t>
+      </w:r>
+      <w:r>
+        <w:t xml:space="preserve"> based on </w:t>
+      </w:r>
+      <w:r>
+        <w:rPr>
+          <w:rStyle w:val="Strong"/>
+        </w:rPr>
+        <w:t>1,000 iterations</w:t>
+      </w:r>
+      <w:r>
+        <w:t xml:space="preserve"> of the stochastic model.</w:t>
+      </w:r>
+      <w:r>
+        <w:t xml:space="preserve"> These have been run over a horizon of 7 years and a human population of 600,000.</w:t>
+      </w:r>
+    </w:p>
+    <w:p>
+      <w:pPr>
+        <w:pStyle w:val="Heading3"/>
+        <w:numPr>
+          <w:ilvl w:val="0"/>
+          <w:numId w:val="1"/>
+        </w:numPr>
+      </w:pPr>
+      <w:r>
+        <w:rPr>
+          <w:rStyle w:val="Strong"/>
+          <w:b w:val="0"/>
+          <w:bCs w:val="0"/>
+        </w:rPr>
+        <w:t xml:space="preserve">Mass Dog </w:t>
+      </w:r>
+      <w:r>
+        <w:rPr>
+          <w:rStyle w:val="Strong"/>
+          <w:b w:val="0"/>
+          <w:bCs w:val="0"/>
+        </w:rPr>
+        <w:t>Vaccination</w:t>
+      </w:r>
+      <w:r>
+        <w:rPr>
+          <w:rStyle w:val="Strong"/>
+          <w:b w:val="0"/>
+          <w:bCs w:val="0"/>
+        </w:rPr>
+        <w:t xml:space="preserve"> (MDV) Sensitivity Analysis</w:t>
+      </w:r>
+    </w:p>
+    <w:p>
+      <w:pPr>
+        <w:rPr>
+          <w:rStyle w:val="Strong"/>
+        </w:rPr>
+      </w:pPr>
+      <w:r>
+        <w:t xml:space="preserve">This section evaluates the impact of </w:t>
+      </w:r>
+      <w:r>
+        <w:rPr>
+          <w:rStyle w:val="Strong"/>
+        </w:rPr>
+        <w:t>varying MDV coverage</w:t>
+      </w:r>
+      <w:r>
+        <w:t xml:space="preserve"> on rabies epidemiology, including:</w:t>
+      </w:r>
+      <w:r>
+        <w:br/>
+      </w:r>
+      <w:r>
+        <w:rPr>
+          <w:rStyle w:val="Strong"/>
+        </w:rPr>
+        <w:t xml:space="preserve">i) </w:t>
+      </w:r>
+      <w:r>
+        <w:rPr>
+          <w:rStyle w:val="Strong"/>
+        </w:rPr>
+        <w:t>Rabid dog population</w:t>
+      </w:r>
+      <w:r>
+        <w:t xml:space="preserve">; </w:t>
+      </w:r>
+      <w:r>
+        <w:rPr>
+          <w:rStyle w:val="Strong"/>
+        </w:rPr>
+        <w:t>ii) E</w:t>
+      </w:r>
+      <w:r>
+        <w:rPr>
+          <w:rStyle w:val="Strong"/>
+        </w:rPr>
+        <w:t>xposures</w:t>
+      </w:r>
+      <w:r>
+        <w:t xml:space="preserve">; iii) </w:t>
+      </w:r>
+      <w:r>
+        <w:rPr>
+          <w:rStyle w:val="Strong"/>
+        </w:rPr>
+        <w:t>Healthy bites</w:t>
+      </w:r>
+      <w:r>
+        <w:t xml:space="preserve">; iv) </w:t>
+      </w:r>
+      <w:r>
+        <w:rPr>
+          <w:rStyle w:val="Strong"/>
+        </w:rPr>
+        <w:t>Rabie</w:t>
+      </w:r>
+      <w:r>
+        <w:rPr>
+          <w:rStyle w:val="Strong"/>
+        </w:rPr>
+        <w:t>s</w:t>
+      </w:r>
+      <w:r>
+        <w:rPr>
+          <w:rStyle w:val="Strong"/>
+        </w:rPr>
+        <w:t xml:space="preserve"> deaths</w:t>
+      </w:r>
+      <w:r>
+        <w:t xml:space="preserve"> &amp; v) </w:t>
+      </w:r>
+      <w:r>
+        <w:rPr>
+          <w:rStyle w:val="Strong"/>
+        </w:rPr>
+        <w:t>Deaths averted due to MDV interventions</w:t>
+      </w:r>
+    </w:p>
+    <w:p>
+      <w:pPr>
+        <w:rPr>
+          <w:rStyle w:val="Strong"/>
+        </w:rPr>
+      </w:pPr>
+    </w:p>
+    <w:p>
+      <w:pPr>
+        <w:rPr>
+          <w:rStyle w:val="Strong"/>
+        </w:rPr>
+      </w:pPr>
+    </w:p>
+    <w:p>
+      <w:pPr>
+        <w:rPr>
           <w:b/>
           <w:bCs/>
-          <w:kern w:val="0"/>
-          <w:sz w:val="36"/>
-          <w:szCs w:val="36"/>
-          <w:lang w:eastAsia="en-GB"/>
-          <w14:ligatures w14:val="none"/>
-        </w:rPr>
-      </w:pPr>
-      <w:r>
-        <w:rPr>
-          <w:rFonts w:ascii="Times New Roman" w:eastAsia="Times New Roman" w:hAnsi="Times New Roman" w:cs="Times New Roman"/>
-          <w:b/>
-          <w:bCs/>
-          <w:kern w:val="0"/>
-          <w:sz w:val="36"/>
-          <w:szCs w:val="36"/>
-          <w:lang w:eastAsia="en-GB"/>
-          <w14:ligatures w14:val="none"/>
-        </w:rPr>
-        <w:t>MDV</w:t>
-      </w:r>
-    </w:p>
-    <w:p>
+        </w:rPr>
+      </w:pPr>
+      <w:r>
+        <w:fldChar w:fldCharType="begin"/>
+      </w:r>
+      <w:r>
+        <w:instrText xml:space="preserve"> INCLUDEPICTURE "http://127.0.0.1:34585/graphics/1f5fb70d-6d87-4e8f-b3de-fae96aaf6b79.png" \* MERGEFORMATINET </w:instrText>
+      </w:r>
+      <w:r>
+        <w:fldChar w:fldCharType="separate"/>
+      </w:r>
       <w:r>
         <w:rPr>
           <w:noProof/>
         </w:rPr>
+        <mc:AlternateContent>
+          <mc:Choice Requires="wps">
+            <w:drawing>
+              <wp:inline distT="0" distB="0" distL="0" distR="0" wp14:anchorId="246640D7" wp14:editId="0543D815">
+                <wp:extent cx="304800" cy="304800"/>
+                <wp:effectExtent l="0" t="0" r="0" b="0"/>
+                <wp:docPr id="926064340" name="Rectangle 25"/>
+                <wp:cNvGraphicFramePr>
+                  <a:graphicFrameLocks xmlns:a="http://schemas.openxmlformats.org/drawingml/2006/main" noChangeAspect="1"/>
+                </wp:cNvGraphicFramePr>
+                <a:graphic xmlns:a="http://schemas.openxmlformats.org/drawingml/2006/main">
+                  <a:graphicData uri="http://schemas.microsoft.com/office/word/2010/wordprocessingShape">
+                    <wps:wsp>
+                      <wps:cNvSpPr>
+                        <a:spLocks noChangeAspect="1" noChangeArrowheads="1"/>
+                      </wps:cNvSpPr>
+                      <wps:spPr bwMode="auto">
+                        <a:xfrm>
+                          <a:off x="0" y="0"/>
+                          <a:ext cx="304800" cy="304800"/>
+                        </a:xfrm>
+                        <a:prstGeom prst="rect">
+                          <a:avLst/>
+                        </a:prstGeom>
+                        <a:noFill/>
+                        <a:ln>
+                          <a:noFill/>
+                        </a:ln>
+                        <a:extLst>
+                          <a:ext uri="{909E8E84-426E-40DD-AFC4-6F175D3DCCD1}">
+                            <a14:hiddenFill xmlns:a14="http://schemas.microsoft.com/office/drawing/2010/main">
+                              <a:solidFill>
+                                <a:srgbClr val="FFFFFF"/>
+                              </a:solidFill>
+                            </a14:hiddenFill>
+                          </a:ext>
+                          <a:ext uri="{91240B29-F687-4F45-9708-019B960494DF}">
+                            <a14:hiddenLine xmlns:a14="http://schemas.microsoft.com/office/drawing/2010/main" w="9525">
+                              <a:solidFill>
+                                <a:srgbClr val="000000"/>
+                              </a:solidFill>
+                              <a:miter lim="800000"/>
+                              <a:headEnd/>
+                              <a:tailEnd/>
+                            </a14:hiddenLine>
+                          </a:ext>
+                        </a:extLst>
+                      </wps:spPr>
+                      <wps:bodyPr rot="0" vert="horz" wrap="square" lIns="91440" tIns="45720" rIns="91440" bIns="45720" anchor="t" anchorCtr="0" upright="1">
+                        <a:noAutofit/>
+                      </wps:bodyPr>
+                    </wps:wsp>
+                  </a:graphicData>
+                </a:graphic>
+              </wp:inline>
+            </w:drawing>
+          </mc:Choice>
+          <mc:Fallback>
+            <w:pict>
+              <v:rect w14:anchorId="53AD784A" id="Rectangle 25" o:spid="_x0000_s1026" style="width:24pt;height:24pt;visibility:visible;mso-wrap-style:square;mso-left-percent:-10001;mso-top-percent:-10001;mso-position-horizontal:absolute;mso-position-horizontal-relative:char;mso-position-vertical:absolute;mso-position-vertical-relative:line;mso-left-percent:-10001;mso-top-percent:-10001;v-text-anchor:top" o:gfxdata="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" filled="f" stroked="f">
+                <o:lock v:ext="edit" aspectratio="t"/>
+                <w10:anchorlock/>
+              </v:rect>
+            </w:pict>
+          </mc:Fallback>
+        </mc:AlternateContent>
+      </w:r>
+      <w:r>
+        <w:fldChar w:fldCharType="end"/>
+      </w:r>
+    </w:p>
+    <w:p>
+      <w:pPr>
+        <w:rPr>
+          <w:lang w:val="en-US"/>
+        </w:rPr>
+      </w:pPr>
+      <w:r>
+        <w:rPr>
+          <w:lang w:val="en-US"/>
+        </w:rPr>
         <w:drawing>
-          <wp:inline distT="0" distB="0" distL="0" distR="0" wp14:anchorId="452E0F81" wp14:editId="03AA3CC7">
-            <wp:extent cx="2646263" cy="1682885"/>
-            <wp:effectExtent l="0" t="0" r="0" b="0"/>
-            <wp:docPr id="2095370664" name="Picture 2" descr="A graph of different colored lines&#10;&#10;Description automatically generated with medium confidence"/>
+          <wp:inline distT="0" distB="0" distL="0" distR="0" wp14:anchorId="2D4ED39E" wp14:editId="7B051412">
+            <wp:extent cx="3704525" cy="2736000"/>
+            <wp:effectExtent l="0" t="0" r="4445" b="0"/>
+            <wp:docPr id="1903812078" name="Picture 1" descr="A graph of different colored lines&#10;&#10;AI-generated content may be incorrect."/>
             <wp:cNvGraphicFramePr>
               <a:graphicFrameLocks xmlns:a="http://schemas.openxmlformats.org/drawingml/2006/main" noChangeAspect="1"/>
             </wp:cNvGraphicFramePr>
@@ -68,17 +364,11 @@
               <a:graphicData uri="http://schemas.openxmlformats.org/drawingml/2006/picture">
                 <pic:pic xmlns:pic="http://schemas.openxmlformats.org/drawingml/2006/picture">
                   <pic:nvPicPr>
-                    <pic:cNvPr id="2095370664" name="Picture 2" descr="A graph of different colored lines&#10;&#10;Description automatically generated with medium confidence"/>
+                    <pic:cNvPr id="1903812078" name="Picture 1" descr="A graph of different colored lines&#10;&#10;AI-generated content may be incorrect."/>
                     <pic:cNvPicPr/>
                   </pic:nvPicPr>
                   <pic:blipFill>
-                    <a:blip r:embed="rId4" cstate="print">
-                      <a:extLst>
-                        <a:ext uri="{28A0092B-C50C-407E-A947-70E740481C1C}">
-                          <a14:useLocalDpi xmlns:a14="http://schemas.microsoft.com/office/drawing/2010/main" val="0"/>
-                        </a:ext>
-                      </a:extLst>
-                    </a:blip>
+                    <a:blip r:embed="rId5"/>
                     <a:stretch>
                       <a:fillRect/>
                     </a:stretch>
@@ -86,7 +376,7 @@
                   <pic:spPr>
                     <a:xfrm>
                       <a:off x="0" y="0"/>
-                      <a:ext cx="2675263" cy="1701328"/>
+                      <a:ext cx="3704525" cy="2736000"/>
                     </a:xfrm>
                     <a:prstGeom prst="rect">
                       <a:avLst/>
@@ -100,13 +390,13 @@
       </w:r>
       <w:r>
         <w:rPr>
-          <w:noProof/>
+          <w:lang w:val="en-US"/>
         </w:rPr>
         <w:drawing>
-          <wp:inline distT="0" distB="0" distL="0" distR="0" wp14:anchorId="4AC0C8F4" wp14:editId="159802A5">
-            <wp:extent cx="2540596" cy="1692612"/>
-            <wp:effectExtent l="0" t="0" r="0" b="0"/>
-            <wp:docPr id="1805615092" name="Picture 1" descr="A graph of different colored lines&#10;&#10;Description automatically generated"/>
+          <wp:inline distT="0" distB="0" distL="0" distR="0" wp14:anchorId="7AFB9140" wp14:editId="5584E48B">
+            <wp:extent cx="3704525" cy="2736000"/>
+            <wp:effectExtent l="0" t="0" r="4445" b="0"/>
+            <wp:docPr id="1724392865" name="Picture 1" descr="A graph of different colored lines&#10;&#10;AI-generated content may be incorrect."/>
             <wp:cNvGraphicFramePr>
               <a:graphicFrameLocks xmlns:a="http://schemas.openxmlformats.org/drawingml/2006/main" noChangeAspect="1"/>
             </wp:cNvGraphicFramePr>
@@ -114,17 +404,11 @@
               <a:graphicData uri="http://schemas.openxmlformats.org/drawingml/2006/picture">
                 <pic:pic xmlns:pic="http://schemas.openxmlformats.org/drawingml/2006/picture">
                   <pic:nvPicPr>
-                    <pic:cNvPr id="1805615092" name="Picture 1" descr="A graph of different colored lines&#10;&#10;Description automatically generated"/>
+                    <pic:cNvPr id="1724392865" name="Picture 1" descr="A graph of different colored lines&#10;&#10;AI-generated content may be incorrect."/>
                     <pic:cNvPicPr/>
                   </pic:nvPicPr>
                   <pic:blipFill>
-                    <a:blip r:embed="rId5" cstate="print">
-                      <a:extLst>
-                        <a:ext uri="{28A0092B-C50C-407E-A947-70E740481C1C}">
-                          <a14:useLocalDpi xmlns:a14="http://schemas.microsoft.com/office/drawing/2010/main" val="0"/>
-                        </a:ext>
-                      </a:extLst>
-                    </a:blip>
+                    <a:blip r:embed="rId6"/>
                     <a:stretch>
                       <a:fillRect/>
                     </a:stretch>
@@ -132,7 +416,7 @@
                   <pic:spPr>
                     <a:xfrm>
                       <a:off x="0" y="0"/>
-                      <a:ext cx="2576371" cy="1716447"/>
+                      <a:ext cx="3704525" cy="2736000"/>
                     </a:xfrm>
                     <a:prstGeom prst="rect">
                       <a:avLst/>
@@ -144,15 +428,25 @@
           </wp:inline>
         </w:drawing>
       </w:r>
-      <w:r>
-        <w:rPr>
-          <w:noProof/>
-        </w:rPr>
+    </w:p>
+    <w:p>
+      <w:pPr>
+        <w:rPr>
+          <w:lang w:val="en-US"/>
+        </w:rPr>
+      </w:pPr>
+    </w:p>
+    <w:p>
+      <w:r>
+        <w:rPr>
+          <w:lang w:val="en-US"/>
+        </w:rPr>
+        <w:lastRenderedPageBreak/>
         <w:drawing>
-          <wp:inline distT="0" distB="0" distL="0" distR="0" wp14:anchorId="748D0981" wp14:editId="5B20D4FE">
-            <wp:extent cx="2588257" cy="1643974"/>
-            <wp:effectExtent l="0" t="0" r="3175" b="0"/>
-            <wp:docPr id="246096781" name="Picture 5" descr="A graph of different colored lines&#10;&#10;Description automatically generated"/>
+          <wp:inline distT="0" distB="0" distL="0" distR="0" wp14:anchorId="6A4793B7" wp14:editId="405C9299">
+            <wp:extent cx="3704527" cy="2736000"/>
+            <wp:effectExtent l="0" t="0" r="4445" b="0"/>
+            <wp:docPr id="544526519" name="Picture 1" descr="A graph of different colored lines&#10;&#10;AI-generated content may be incorrect."/>
             <wp:cNvGraphicFramePr>
               <a:graphicFrameLocks xmlns:a="http://schemas.openxmlformats.org/drawingml/2006/main" noChangeAspect="1"/>
             </wp:cNvGraphicFramePr>
@@ -160,17 +454,11 @@
               <a:graphicData uri="http://schemas.openxmlformats.org/drawingml/2006/picture">
                 <pic:pic xmlns:pic="http://schemas.openxmlformats.org/drawingml/2006/picture">
                   <pic:nvPicPr>
-                    <pic:cNvPr id="246096781" name="Picture 5" descr="A graph of different colored lines&#10;&#10;Description automatically generated"/>
+                    <pic:cNvPr id="544526519" name="Picture 1" descr="A graph of different colored lines&#10;&#10;AI-generated content may be incorrect."/>
                     <pic:cNvPicPr/>
                   </pic:nvPicPr>
                   <pic:blipFill>
-                    <a:blip r:embed="rId6" cstate="print">
-                      <a:extLst>
-                        <a:ext uri="{28A0092B-C50C-407E-A947-70E740481C1C}">
-                          <a14:useLocalDpi xmlns:a14="http://schemas.microsoft.com/office/drawing/2010/main" val="0"/>
-                        </a:ext>
-                      </a:extLst>
-                    </a:blip>
+                    <a:blip r:embed="rId7"/>
                     <a:stretch>
                       <a:fillRect/>
                     </a:stretch>
@@ -178,7 +466,7 @@
                   <pic:spPr>
                     <a:xfrm>
                       <a:off x="0" y="0"/>
-                      <a:ext cx="2643114" cy="1678818"/>
+                      <a:ext cx="3704527" cy="2736000"/>
                     </a:xfrm>
                     <a:prstGeom prst="rect">
                       <a:avLst/>
@@ -190,17 +478,12 @@
           </wp:inline>
         </w:drawing>
       </w:r>
-    </w:p>
-    <w:p>
-      <w:r>
-        <w:rPr>
-          <w:noProof/>
-        </w:rPr>
+      <w:r>
         <w:drawing>
-          <wp:inline distT="0" distB="0" distL="0" distR="0" wp14:anchorId="66805751" wp14:editId="10F67CDD">
-            <wp:extent cx="2645923" cy="1680519"/>
-            <wp:effectExtent l="0" t="0" r="0" b="0"/>
-            <wp:docPr id="594314915" name="Picture 3" descr="A graph of different colors&#10;&#10;Description automatically generated with medium confidence"/>
+          <wp:inline distT="0" distB="0" distL="0" distR="0" wp14:anchorId="4350AFA9" wp14:editId="1D5A5D69">
+            <wp:extent cx="3704526" cy="2736000"/>
+            <wp:effectExtent l="0" t="0" r="4445" b="0"/>
+            <wp:docPr id="370612732" name="Picture 1" descr="A graph of different colored lines&#10;&#10;AI-generated content may be incorrect."/>
             <wp:cNvGraphicFramePr>
               <a:graphicFrameLocks xmlns:a="http://schemas.openxmlformats.org/drawingml/2006/main" noChangeAspect="1"/>
             </wp:cNvGraphicFramePr>
@@ -208,17 +491,11 @@
               <a:graphicData uri="http://schemas.openxmlformats.org/drawingml/2006/picture">
                 <pic:pic xmlns:pic="http://schemas.openxmlformats.org/drawingml/2006/picture">
                   <pic:nvPicPr>
-                    <pic:cNvPr id="594314915" name="Picture 3" descr="A graph of different colors&#10;&#10;Description automatically generated with medium confidence"/>
+                    <pic:cNvPr id="370612732" name="Picture 1" descr="A graph of different colored lines&#10;&#10;AI-generated content may be incorrect."/>
                     <pic:cNvPicPr/>
                   </pic:nvPicPr>
                   <pic:blipFill>
-                    <a:blip r:embed="rId7" cstate="print">
-                      <a:extLst>
-                        <a:ext uri="{28A0092B-C50C-407E-A947-70E740481C1C}">
-                          <a14:useLocalDpi xmlns:a14="http://schemas.microsoft.com/office/drawing/2010/main" val="0"/>
-                        </a:ext>
-                      </a:extLst>
-                    </a:blip>
+                    <a:blip r:embed="rId8"/>
                     <a:stretch>
                       <a:fillRect/>
                     </a:stretch>
@@ -226,7 +503,7 @@
                   <pic:spPr>
                     <a:xfrm>
                       <a:off x="0" y="0"/>
-                      <a:ext cx="2701041" cy="1715526"/>
+                      <a:ext cx="3704526" cy="2736000"/>
                     </a:xfrm>
                     <a:prstGeom prst="rect">
                       <a:avLst/>
@@ -238,15 +515,19 @@
           </wp:inline>
         </w:drawing>
       </w:r>
-      <w:r>
-        <w:rPr>
-          <w:noProof/>
-        </w:rPr>
+    </w:p>
+    <w:p>
+      <w:pPr>
+        <w:rPr>
+          <w:lang w:val="en-US"/>
+        </w:rPr>
+      </w:pPr>
+      <w:r>
         <w:drawing>
-          <wp:inline distT="0" distB="0" distL="0" distR="0" wp14:anchorId="33789773" wp14:editId="5769CD51">
-            <wp:extent cx="2572942" cy="1634247"/>
-            <wp:effectExtent l="0" t="0" r="5715" b="4445"/>
-            <wp:docPr id="2054842670" name="Picture 4" descr="A graph of different colored lines&#10;&#10;Description automatically generated with medium confidence"/>
+          <wp:inline distT="0" distB="0" distL="0" distR="0" wp14:anchorId="00063D54" wp14:editId="5C2798C2">
+            <wp:extent cx="3704525" cy="2736000"/>
+            <wp:effectExtent l="0" t="0" r="4445" b="0"/>
+            <wp:docPr id="618180159" name="Picture 1" descr="A graph of different colored lines&#10;&#10;AI-generated content may be incorrect."/>
             <wp:cNvGraphicFramePr>
               <a:graphicFrameLocks xmlns:a="http://schemas.openxmlformats.org/drawingml/2006/main" noChangeAspect="1"/>
             </wp:cNvGraphicFramePr>
@@ -254,17 +535,11 @@
               <a:graphicData uri="http://schemas.openxmlformats.org/drawingml/2006/picture">
                 <pic:pic xmlns:pic="http://schemas.openxmlformats.org/drawingml/2006/picture">
                   <pic:nvPicPr>
-                    <pic:cNvPr id="2054842670" name="Picture 4" descr="A graph of different colored lines&#10;&#10;Description automatically generated with medium confidence"/>
+                    <pic:cNvPr id="618180159" name="Picture 1" descr="A graph of different colored lines&#10;&#10;AI-generated content may be incorrect."/>
                     <pic:cNvPicPr/>
                   </pic:nvPicPr>
                   <pic:blipFill>
-                    <a:blip r:embed="rId8" cstate="print">
-                      <a:extLst>
-                        <a:ext uri="{28A0092B-C50C-407E-A947-70E740481C1C}">
-                          <a14:useLocalDpi xmlns:a14="http://schemas.microsoft.com/office/drawing/2010/main" val="0"/>
-                        </a:ext>
-                      </a:extLst>
-                    </a:blip>
+                    <a:blip r:embed="rId9"/>
                     <a:stretch>
                       <a:fillRect/>
                     </a:stretch>
@@ -272,7 +547,7 @@
                   <pic:spPr>
                     <a:xfrm>
                       <a:off x="0" y="0"/>
-                      <a:ext cx="2622694" cy="1665848"/>
+                      <a:ext cx="3704525" cy="2736000"/>
                     </a:xfrm>
                     <a:prstGeom prst="rect">
                       <a:avLst/>
@@ -285,14 +560,132 @@
         </w:drawing>
       </w:r>
       <w:r>
+        <w:br w:type="page"/>
+      </w:r>
+      <w:r>
+        <w:lastRenderedPageBreak/>
+        <w:fldChar w:fldCharType="begin"/>
+      </w:r>
+      <w:r>
+        <w:instrText xml:space="preserve"> INCLUDEPICTURE "http://127.0.0.1:34585/graphics/5ee61211-ab61-4439-9a03-f5161360b3c4.png" \* MERGEFORMATINET </w:instrText>
+      </w:r>
+      <w:r>
+        <w:fldChar w:fldCharType="separate"/>
+      </w:r>
+      <w:r>
         <w:rPr>
           <w:noProof/>
         </w:rPr>
+        <mc:AlternateContent>
+          <mc:Choice Requires="wps">
+            <w:drawing>
+              <wp:inline distT="0" distB="0" distL="0" distR="0" wp14:anchorId="22ECC73D" wp14:editId="70A9D65E">
+                <wp:extent cx="304800" cy="304800"/>
+                <wp:effectExtent l="0" t="0" r="0" b="0"/>
+                <wp:docPr id="1674930974" name="Rectangle 26"/>
+                <wp:cNvGraphicFramePr>
+                  <a:graphicFrameLocks xmlns:a="http://schemas.openxmlformats.org/drawingml/2006/main" noChangeAspect="1"/>
+                </wp:cNvGraphicFramePr>
+                <a:graphic xmlns:a="http://schemas.openxmlformats.org/drawingml/2006/main">
+                  <a:graphicData uri="http://schemas.microsoft.com/office/word/2010/wordprocessingShape">
+                    <wps:wsp>
+                      <wps:cNvSpPr>
+                        <a:spLocks noChangeAspect="1" noChangeArrowheads="1"/>
+                      </wps:cNvSpPr>
+                      <wps:spPr bwMode="auto">
+                        <a:xfrm>
+                          <a:off x="0" y="0"/>
+                          <a:ext cx="304800" cy="304800"/>
+                        </a:xfrm>
+                        <a:prstGeom prst="rect">
+                          <a:avLst/>
+                        </a:prstGeom>
+                        <a:noFill/>
+                        <a:ln>
+                          <a:noFill/>
+                        </a:ln>
+                        <a:extLst>
+                          <a:ext uri="{909E8E84-426E-40DD-AFC4-6F175D3DCCD1}">
+                            <a14:hiddenFill xmlns:a14="http://schemas.microsoft.com/office/drawing/2010/main">
+                              <a:solidFill>
+                                <a:srgbClr val="FFFFFF"/>
+                              </a:solidFill>
+                            </a14:hiddenFill>
+                          </a:ext>
+                          <a:ext uri="{91240B29-F687-4F45-9708-019B960494DF}">
+                            <a14:hiddenLine xmlns:a14="http://schemas.microsoft.com/office/drawing/2010/main" w="9525">
+                              <a:solidFill>
+                                <a:srgbClr val="000000"/>
+                              </a:solidFill>
+                              <a:miter lim="800000"/>
+                              <a:headEnd/>
+                              <a:tailEnd/>
+                            </a14:hiddenLine>
+                          </a:ext>
+                        </a:extLst>
+                      </wps:spPr>
+                      <wps:bodyPr rot="0" vert="horz" wrap="square" lIns="91440" tIns="45720" rIns="91440" bIns="45720" anchor="t" anchorCtr="0" upright="1">
+                        <a:noAutofit/>
+                      </wps:bodyPr>
+                    </wps:wsp>
+                  </a:graphicData>
+                </a:graphic>
+              </wp:inline>
+            </w:drawing>
+          </mc:Choice>
+          <mc:Fallback>
+            <w:pict>
+              <v:rect w14:anchorId="107F7AFE" id="Rectangle 26" o:spid="_x0000_s1026" style="width:24pt;height:24pt;visibility:visible;mso-wrap-style:square;mso-left-percent:-10001;mso-top-percent:-10001;mso-position-horizontal:absolute;mso-position-horizontal-relative:char;mso-position-vertical:absolute;mso-position-vertical-relative:line;mso-left-percent:-10001;mso-top-percent:-10001;v-text-anchor:top" o:gfxdata="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" filled="f" stroked="f">
+                <o:lock v:ext="edit" aspectratio="t"/>
+                <w10:anchorlock/>
+              </v:rect>
+            </w:pict>
+          </mc:Fallback>
+        </mc:AlternateContent>
+      </w:r>
+      <w:r>
+        <w:fldChar w:fldCharType="end"/>
+      </w:r>
+    </w:p>
+    <w:p>
+      <w:pPr>
+        <w:pStyle w:val="Heading3"/>
+        <w:numPr>
+          <w:ilvl w:val="0"/>
+          <w:numId w:val="1"/>
+        </w:numPr>
+      </w:pPr>
+      <w:r>
+        <w:t>Human-Dog Ratio (HDR) Sensitivity Analysis</w:t>
+      </w:r>
+    </w:p>
+    <w:p>
+      <w:r>
+        <w:t>Sensitivity Analysis of HDR to rabid dogs, exposures, healthy bites &amp; deaths incurred</w:t>
+      </w:r>
+    </w:p>
+    <w:p>
+      <w:pPr>
+        <w:rPr>
+          <w:lang w:val="en-US"/>
+        </w:rPr>
+      </w:pPr>
+    </w:p>
+    <w:p>
+      <w:pPr>
+        <w:rPr>
+          <w:lang w:val="en-US"/>
+        </w:rPr>
+      </w:pPr>
+      <w:r>
+        <w:rPr>
+          <w:lang w:val="en-US"/>
+        </w:rPr>
         <w:drawing>
-          <wp:inline distT="0" distB="0" distL="0" distR="0" wp14:anchorId="3DA50858" wp14:editId="1EA5BDA9">
-            <wp:extent cx="2481051" cy="1575881"/>
+          <wp:inline distT="0" distB="0" distL="0" distR="0" wp14:anchorId="15D1015A" wp14:editId="7BD777ED">
+            <wp:extent cx="4104486" cy="4864100"/>
             <wp:effectExtent l="0" t="0" r="0" b="0"/>
-            <wp:docPr id="1862409261" name="Picture 6" descr="A graph of different colored lines&#10;&#10;Description automatically generated"/>
+            <wp:docPr id="1934154385" name="Picture 1" descr="A screenshot of a graph&#10;&#10;AI-generated content may be incorrect."/>
             <wp:cNvGraphicFramePr>
               <a:graphicFrameLocks xmlns:a="http://schemas.openxmlformats.org/drawingml/2006/main" noChangeAspect="1"/>
             </wp:cNvGraphicFramePr>
@@ -300,17 +693,11 @@
               <a:graphicData uri="http://schemas.openxmlformats.org/drawingml/2006/picture">
                 <pic:pic xmlns:pic="http://schemas.openxmlformats.org/drawingml/2006/picture">
                   <pic:nvPicPr>
-                    <pic:cNvPr id="1862409261" name="Picture 6" descr="A graph of different colored lines&#10;&#10;Description automatically generated"/>
+                    <pic:cNvPr id="1934154385" name="Picture 1" descr="A screenshot of a graph&#10;&#10;AI-generated content may be incorrect."/>
                     <pic:cNvPicPr/>
                   </pic:nvPicPr>
                   <pic:blipFill>
-                    <a:blip r:embed="rId9" cstate="print">
-                      <a:extLst>
-                        <a:ext uri="{28A0092B-C50C-407E-A947-70E740481C1C}">
-                          <a14:useLocalDpi xmlns:a14="http://schemas.microsoft.com/office/drawing/2010/main" val="0"/>
-                        </a:ext>
-                      </a:extLst>
-                    </a:blip>
+                    <a:blip r:embed="rId10"/>
                     <a:stretch>
                       <a:fillRect/>
                     </a:stretch>
@@ -318,7 +705,7 @@
                   <pic:spPr>
                     <a:xfrm>
                       <a:off x="0" y="0"/>
-                      <a:ext cx="2525150" cy="1603891"/>
+                      <a:ext cx="4143692" cy="4910561"/>
                     </a:xfrm>
                     <a:prstGeom prst="rect">
                       <a:avLst/>
@@ -330,89 +717,15 @@
           </wp:inline>
         </w:drawing>
       </w:r>
-    </w:p>
-    <w:p/>
-    <w:p/>
-    <w:p/>
-    <w:p>
-      <w:pPr>
-        <w:rPr>
-          <w:lang w:val="en-US"/>
-        </w:rPr>
-      </w:pPr>
-    </w:p>
-    <w:p>
-      <w:pPr>
-        <w:rPr>
-          <w:lang w:val="en-US"/>
-        </w:rPr>
-      </w:pPr>
-    </w:p>
-    <w:p>
-      <w:pPr>
-        <w:rPr>
-          <w:lang w:val="en-US"/>
-        </w:rPr>
-      </w:pPr>
-    </w:p>
-    <w:p>
-      <w:pPr>
-        <w:rPr>
-          <w:lang w:val="en-US"/>
-        </w:rPr>
-      </w:pPr>
-    </w:p>
-    <w:p>
-      <w:pPr>
-        <w:rPr>
-          <w:lang w:val="en-US"/>
-        </w:rPr>
-      </w:pPr>
-    </w:p>
-    <w:p>
-      <w:pPr>
-        <w:rPr>
-          <w:lang w:val="en-US"/>
-        </w:rPr>
-      </w:pPr>
-    </w:p>
-    <w:p>
-      <w:pPr>
-        <w:rPr>
-          <w:lang w:val="en-US"/>
-        </w:rPr>
-      </w:pPr>
-      <w:r>
-        <w:rPr>
-          <w:lang w:val="en-US"/>
-        </w:rPr>
-        <w:lastRenderedPageBreak/>
-        <w:t>HDR</w:t>
-      </w:r>
-    </w:p>
-    <w:p>
-      <w:pPr>
-        <w:rPr>
-          <w:lang w:val="en-US"/>
-        </w:rPr>
-      </w:pPr>
-    </w:p>
-    <w:p>
-      <w:pPr>
-        <w:rPr>
-          <w:lang w:val="en-US"/>
-        </w:rPr>
-      </w:pPr>
-      <w:r>
-        <w:rPr>
-          <w:noProof/>
+      <w:r>
+        <w:rPr>
           <w:lang w:val="en-US"/>
         </w:rPr>
         <w:drawing>
-          <wp:inline distT="0" distB="0" distL="0" distR="0" wp14:anchorId="5D4C9763" wp14:editId="5FECE8A4">
-            <wp:extent cx="4017523" cy="4668297"/>
-            <wp:effectExtent l="0" t="0" r="0" b="5715"/>
-            <wp:docPr id="415110122" name="Picture 7" descr="A screenshot of a graph&#10;&#10;Description automatically generated"/>
+          <wp:inline distT="0" distB="0" distL="0" distR="0" wp14:anchorId="573F5642" wp14:editId="4B30EA9C">
+            <wp:extent cx="4101109" cy="4860000"/>
+            <wp:effectExtent l="0" t="0" r="1270" b="4445"/>
+            <wp:docPr id="1285797214" name="Picture 1"/>
             <wp:cNvGraphicFramePr>
               <a:graphicFrameLocks xmlns:a="http://schemas.openxmlformats.org/drawingml/2006/main" noChangeAspect="1"/>
             </wp:cNvGraphicFramePr>
@@ -420,54 +733,7 @@
               <a:graphicData uri="http://schemas.openxmlformats.org/drawingml/2006/picture">
                 <pic:pic xmlns:pic="http://schemas.openxmlformats.org/drawingml/2006/picture">
                   <pic:nvPicPr>
-                    <pic:cNvPr id="415110122" name="Picture 7" descr="A screenshot of a graph&#10;&#10;Description automatically generated"/>
-                    <pic:cNvPicPr/>
-                  </pic:nvPicPr>
-                  <pic:blipFill>
-                    <a:blip r:embed="rId10" cstate="print">
-                      <a:extLst>
-                        <a:ext uri="{28A0092B-C50C-407E-A947-70E740481C1C}">
-                          <a14:useLocalDpi xmlns:a14="http://schemas.microsoft.com/office/drawing/2010/main" val="0"/>
-                        </a:ext>
-                      </a:extLst>
-                    </a:blip>
-                    <a:stretch>
-                      <a:fillRect/>
-                    </a:stretch>
-                  </pic:blipFill>
-                  <pic:spPr>
-                    <a:xfrm>
-                      <a:off x="0" y="0"/>
-                      <a:ext cx="4038594" cy="4692781"/>
-                    </a:xfrm>
-                    <a:prstGeom prst="rect">
-                      <a:avLst/>
-                    </a:prstGeom>
-                  </pic:spPr>
-                </pic:pic>
-              </a:graphicData>
-            </a:graphic>
-          </wp:inline>
-        </w:drawing>
-      </w:r>
-      <w:r>
-        <w:rPr>
-          <w:noProof/>
-          <w:lang w:val="en-US"/>
-        </w:rPr>
-        <w:drawing>
-          <wp:inline distT="0" distB="0" distL="0" distR="0" wp14:anchorId="5D875156" wp14:editId="65433FA1">
-            <wp:extent cx="4056434" cy="4548121"/>
-            <wp:effectExtent l="0" t="0" r="0" b="0"/>
-            <wp:docPr id="876683305" name="Picture 8" descr="A screenshot of a graph&#10;&#10;Description automatically generated"/>
-            <wp:cNvGraphicFramePr>
-              <a:graphicFrameLocks xmlns:a="http://schemas.openxmlformats.org/drawingml/2006/main" noChangeAspect="1"/>
-            </wp:cNvGraphicFramePr>
-            <a:graphic xmlns:a="http://schemas.openxmlformats.org/drawingml/2006/main">
-              <a:graphicData uri="http://schemas.openxmlformats.org/drawingml/2006/picture">
-                <pic:pic xmlns:pic="http://schemas.openxmlformats.org/drawingml/2006/picture">
-                  <pic:nvPicPr>
-                    <pic:cNvPr id="876683305" name="Picture 8" descr="A screenshot of a graph&#10;&#10;Description automatically generated"/>
+                    <pic:cNvPr id="1285797214" name="Picture 1"/>
                     <pic:cNvPicPr/>
                   </pic:nvPicPr>
                   <pic:blipFill>
@@ -485,7 +751,7 @@
                   <pic:spPr>
                     <a:xfrm>
                       <a:off x="0" y="0"/>
-                      <a:ext cx="4077464" cy="4571700"/>
+                      <a:ext cx="4101109" cy="4860000"/>
                     </a:xfrm>
                     <a:prstGeom prst="rect">
                       <a:avLst/>
@@ -514,93 +780,64 @@
     </w:p>
     <w:p>
       <w:pPr>
-        <w:rPr>
-          <w:lang w:val="en-US"/>
-        </w:rPr>
-      </w:pPr>
-    </w:p>
-    <w:p>
-      <w:pPr>
-        <w:rPr>
-          <w:lang w:val="en-US"/>
-        </w:rPr>
-      </w:pPr>
-      <w:r>
-        <w:rPr>
-          <w:lang w:val="en-US"/>
-        </w:rPr>
-        <w:t>MDV_HDR</w:t>
-      </w:r>
-      <w:r>
-        <w:rPr>
-          <w:lang w:val="en-US"/>
-        </w:rPr>
-        <w:br/>
-      </w:r>
-      <w:r>
-        <w:rPr>
-          <w:lang w:val="en-US"/>
-        </w:rPr>
-        <w:br/>
-        <w:t>Interactive 3D</w:t>
-      </w:r>
-      <w:r>
-        <w:rPr>
-          <w:lang w:val="en-US"/>
-        </w:rPr>
-        <w:br/>
-      </w:r>
+        <w:pStyle w:val="Heading3"/>
+        <w:numPr>
+          <w:ilvl w:val="0"/>
+          <w:numId w:val="1"/>
+        </w:numPr>
+        <w:rPr>
+          <w:lang w:val="en-US"/>
+        </w:rPr>
+      </w:pPr>
       <w:r>
         <w:rPr>
           <w:lang w:val="en-US"/>
         </w:rPr>
         <w:lastRenderedPageBreak/>
-        <w:br/>
-      </w:r>
-      <w:proofErr w:type="spellStart"/>
-      <w:r>
-        <w:rPr>
-          <w:lang w:val="en-US"/>
-        </w:rPr>
-        <w:t>pSeek</w:t>
-      </w:r>
-      <w:proofErr w:type="spellEnd"/>
-      <w:r>
-        <w:rPr>
-          <w:lang w:val="en-US"/>
-        </w:rPr>
-        <w:t xml:space="preserve">                                                                                                                       </w:t>
-      </w:r>
-      <w:proofErr w:type="spellStart"/>
-      <w:r>
-        <w:rPr>
-          <w:lang w:val="en-US"/>
-        </w:rPr>
-        <w:t>pStart</w:t>
-      </w:r>
-      <w:proofErr w:type="spellEnd"/>
-      <w:r>
-        <w:rPr>
-          <w:lang w:val="en-US"/>
-        </w:rPr>
-        <w:br/>
-      </w:r>
-      <w:r>
-        <w:rPr>
-          <w:lang w:val="en-US"/>
-        </w:rPr>
-        <w:br/>
-      </w:r>
+        <w:t>A combination of MDV and HDR</w:t>
+      </w:r>
+    </w:p>
+    <w:p>
+      <w:pPr>
+        <w:rPr>
+          <w:lang w:val="en-US"/>
+        </w:rPr>
+      </w:pPr>
+      <w:r>
+        <w:rPr>
+          <w:lang w:val="en-US"/>
+        </w:rPr>
+        <w:t>This generates interactive 3D plots, which I’ve then captured in png</w:t>
+      </w:r>
+      <w:r>
+        <w:rPr>
+          <w:lang w:val="en-US"/>
+        </w:rPr>
+        <w:t xml:space="preserve"> – html files available as attachments</w:t>
+      </w:r>
+    </w:p>
+    <w:p>
+      <w:pPr>
+        <w:rPr>
+          <w:lang w:val="en-US"/>
+        </w:rPr>
+      </w:pPr>
       <w:r>
         <w:rPr>
           <w:noProof/>
+        </w:rPr>
+        <w:t xml:space="preserve"> </w:t>
+      </w:r>
+      <w:r>
+        <w:rPr>
+          <w:noProof/>
           <w:lang w:val="en-US"/>
         </w:rPr>
         <w:drawing>
-          <wp:inline distT="0" distB="0" distL="0" distR="0" wp14:anchorId="0026BF6B" wp14:editId="269159AC">
-            <wp:extent cx="4055486" cy="5457218"/>
-            <wp:effectExtent l="0" t="0" r="0" b="3810"/>
-            <wp:docPr id="7334797" name="Picture 9" descr="A group of graphs with different colored lines&#10;&#10;Description automatically generated with medium confidence"/>
+          <wp:inline distT="0" distB="0" distL="0" distR="0" wp14:anchorId="581F18CE" wp14:editId="0FF8C849">
+            <wp:extent cx="2589132" cy="2880000"/>
+            <wp:effectExtent l="0" t="0" r="1905" b="3175"/>
+            <wp:docPr id="628421986" name="Picture 29" descr="A graph with numbers and lines&#10;&#10;AI-generated content may be incorrect."/>
             <wp:cNvGraphicFramePr>
               <a:graphicFrameLocks xmlns:a="http://schemas.openxmlformats.org/drawingml/2006/main" noChangeAspect="1"/>
             </wp:cNvGraphicFramePr>
@@ -608,7 +845,7 @@
               <a:graphicData uri="http://schemas.openxmlformats.org/drawingml/2006/picture">
                 <pic:pic xmlns:pic="http://schemas.openxmlformats.org/drawingml/2006/picture">
                   <pic:nvPicPr>
-                    <pic:cNvPr id="7334797" name="Picture 9" descr="A group of graphs with different colored lines&#10;&#10;Description automatically generated with medium confidence"/>
+                    <pic:cNvPr id="628421986" name="Picture 29" descr="A graph with numbers and lines&#10;&#10;AI-generated content may be incorrect."/>
                     <pic:cNvPicPr/>
                   </pic:nvPicPr>
                   <pic:blipFill>
@@ -626,7 +863,7 @@
                   <pic:spPr>
                     <a:xfrm>
                       <a:off x="0" y="0"/>
-                      <a:ext cx="4060093" cy="5463418"/>
+                      <a:ext cx="2589132" cy="2880000"/>
                     </a:xfrm>
                     <a:prstGeom prst="rect">
                       <a:avLst/>
@@ -640,20 +877,14 @@
       </w:r>
       <w:r>
         <w:rPr>
-          <w:lang w:val="en-US"/>
-        </w:rPr>
-        <w:t xml:space="preserve">      </w:t>
-      </w:r>
-      <w:r>
-        <w:rPr>
           <w:noProof/>
           <w:lang w:val="en-US"/>
         </w:rPr>
         <w:drawing>
-          <wp:inline distT="0" distB="0" distL="0" distR="0" wp14:anchorId="795FDA39" wp14:editId="5EFC2756">
-            <wp:extent cx="4182893" cy="5491269"/>
-            <wp:effectExtent l="0" t="0" r="0" b="0"/>
-            <wp:docPr id="1172881162" name="Picture 10" descr="A group of graphs with numbers and numbers&#10;&#10;Description automatically generated with medium confidence"/>
+          <wp:inline distT="0" distB="0" distL="0" distR="0" wp14:anchorId="1B4E8880" wp14:editId="1454B036">
+            <wp:extent cx="2589132" cy="2880000"/>
+            <wp:effectExtent l="0" t="0" r="1905" b="3175"/>
+            <wp:docPr id="1841723023" name="Picture 30" descr="A graph with numbers and lines&#10;&#10;AI-generated content may be incorrect."/>
             <wp:cNvGraphicFramePr>
               <a:graphicFrameLocks xmlns:a="http://schemas.openxmlformats.org/drawingml/2006/main" noChangeAspect="1"/>
             </wp:cNvGraphicFramePr>
@@ -661,7 +892,7 @@
               <a:graphicData uri="http://schemas.openxmlformats.org/drawingml/2006/picture">
                 <pic:pic xmlns:pic="http://schemas.openxmlformats.org/drawingml/2006/picture">
                   <pic:nvPicPr>
-                    <pic:cNvPr id="1172881162" name="Picture 10" descr="A group of graphs with numbers and numbers&#10;&#10;Description automatically generated with medium confidence"/>
+                    <pic:cNvPr id="1841723023" name="Picture 30" descr="A graph with numbers and lines&#10;&#10;AI-generated content may be incorrect."/>
                     <pic:cNvPicPr/>
                   </pic:nvPicPr>
                   <pic:blipFill>
@@ -679,7 +910,7 @@
                   <pic:spPr>
                     <a:xfrm>
                       <a:off x="0" y="0"/>
-                      <a:ext cx="4194122" cy="5506010"/>
+                      <a:ext cx="2589132" cy="2880000"/>
                     </a:xfrm>
                     <a:prstGeom prst="rect">
                       <a:avLst/>
@@ -691,58 +922,16 @@
           </wp:inline>
         </w:drawing>
       </w:r>
-    </w:p>
-    <w:p>
-      <w:pPr>
-        <w:rPr>
-          <w:lang w:val="en-US"/>
-        </w:rPr>
-      </w:pPr>
-    </w:p>
-    <w:p>
-      <w:pPr>
-        <w:rPr>
-          <w:lang w:val="en-US"/>
-        </w:rPr>
-      </w:pPr>
-    </w:p>
-    <w:p>
-      <w:pPr>
-        <w:rPr>
-          <w:lang w:val="en-US"/>
-        </w:rPr>
-      </w:pPr>
-      <w:proofErr w:type="spellStart"/>
-      <w:r>
-        <w:rPr>
-          <w:lang w:val="en-US"/>
-        </w:rPr>
-        <w:t>pComplete</w:t>
-      </w:r>
-      <w:proofErr w:type="spellEnd"/>
-    </w:p>
-    <w:p>
-      <w:pPr>
-        <w:rPr>
-          <w:lang w:val="en-US"/>
-        </w:rPr>
-      </w:pPr>
-      <w:r>
-        <w:rPr>
-          <w:lang w:val="en-US"/>
-        </w:rPr>
-        <w:br/>
-      </w:r>
       <w:r>
         <w:rPr>
           <w:noProof/>
           <w:lang w:val="en-US"/>
         </w:rPr>
         <w:drawing>
-          <wp:inline distT="0" distB="0" distL="0" distR="0" wp14:anchorId="18E0E8B2" wp14:editId="74C7C8BF">
-            <wp:extent cx="4260715" cy="5593431"/>
-            <wp:effectExtent l="0" t="0" r="0" b="0"/>
-            <wp:docPr id="1137282329" name="Picture 11" descr="A group of graphs with numbers and text&#10;&#10;Description automatically generated with medium confidence"/>
+          <wp:inline distT="0" distB="0" distL="0" distR="0" wp14:anchorId="480A83B5" wp14:editId="7AF49713">
+            <wp:extent cx="2589132" cy="2880000"/>
+            <wp:effectExtent l="0" t="0" r="1905" b="3175"/>
+            <wp:docPr id="1501418482" name="Picture 31" descr="A graph with different colored dots&#10;&#10;AI-generated content may be incorrect."/>
             <wp:cNvGraphicFramePr>
               <a:graphicFrameLocks xmlns:a="http://schemas.openxmlformats.org/drawingml/2006/main" noChangeAspect="1"/>
             </wp:cNvGraphicFramePr>
@@ -750,7 +939,7 @@
               <a:graphicData uri="http://schemas.openxmlformats.org/drawingml/2006/picture">
                 <pic:pic xmlns:pic="http://schemas.openxmlformats.org/drawingml/2006/picture">
                   <pic:nvPicPr>
-                    <pic:cNvPr id="1137282329" name="Picture 11" descr="A group of graphs with numbers and text&#10;&#10;Description automatically generated with medium confidence"/>
+                    <pic:cNvPr id="1501418482" name="Picture 31" descr="A graph with different colored dots&#10;&#10;AI-generated content may be incorrect."/>
                     <pic:cNvPicPr/>
                   </pic:nvPicPr>
                   <pic:blipFill>
@@ -768,7 +957,7 @@
                   <pic:spPr>
                     <a:xfrm>
                       <a:off x="0" y="0"/>
-                      <a:ext cx="4273189" cy="5609807"/>
+                      <a:ext cx="2589132" cy="2880000"/>
                     </a:xfrm>
                     <a:prstGeom prst="rect">
                       <a:avLst/>
@@ -781,6 +970,398 @@
         </w:drawing>
       </w:r>
     </w:p>
+    <w:p>
+      <w:pPr>
+        <w:rPr>
+          <w:lang w:val="en-US"/>
+        </w:rPr>
+      </w:pPr>
+      <w:r>
+        <w:rPr>
+          <w:noProof/>
+          <w:lang w:val="en-US"/>
+        </w:rPr>
+        <w:drawing>
+          <wp:inline distT="0" distB="0" distL="0" distR="0" wp14:anchorId="11F3AAF5" wp14:editId="45196997">
+            <wp:extent cx="2589132" cy="2880000"/>
+            <wp:effectExtent l="0" t="0" r="1905" b="3175"/>
+            <wp:docPr id="566729941" name="Picture 32" descr="A graph with numbers and lines&#10;&#10;AI-generated content may be incorrect."/>
+            <wp:cNvGraphicFramePr>
+              <a:graphicFrameLocks xmlns:a="http://schemas.openxmlformats.org/drawingml/2006/main" noChangeAspect="1"/>
+            </wp:cNvGraphicFramePr>
+            <a:graphic xmlns:a="http://schemas.openxmlformats.org/drawingml/2006/main">
+              <a:graphicData uri="http://schemas.openxmlformats.org/drawingml/2006/picture">
+                <pic:pic xmlns:pic="http://schemas.openxmlformats.org/drawingml/2006/picture">
+                  <pic:nvPicPr>
+                    <pic:cNvPr id="566729941" name="Picture 32" descr="A graph with numbers and lines&#10;&#10;AI-generated content may be incorrect."/>
+                    <pic:cNvPicPr/>
+                  </pic:nvPicPr>
+                  <pic:blipFill>
+                    <a:blip r:embed="rId15" cstate="print">
+                      <a:extLst>
+                        <a:ext uri="{28A0092B-C50C-407E-A947-70E740481C1C}">
+                          <a14:useLocalDpi xmlns:a14="http://schemas.microsoft.com/office/drawing/2010/main" val="0"/>
+                        </a:ext>
+                      </a:extLst>
+                    </a:blip>
+                    <a:stretch>
+                      <a:fillRect/>
+                    </a:stretch>
+                  </pic:blipFill>
+                  <pic:spPr>
+                    <a:xfrm>
+                      <a:off x="0" y="0"/>
+                      <a:ext cx="2589132" cy="2880000"/>
+                    </a:xfrm>
+                    <a:prstGeom prst="rect">
+                      <a:avLst/>
+                    </a:prstGeom>
+                  </pic:spPr>
+                </pic:pic>
+              </a:graphicData>
+            </a:graphic>
+          </wp:inline>
+        </w:drawing>
+      </w:r>
+      <w:r>
+        <w:rPr>
+          <w:noProof/>
+          <w:lang w:val="en-US"/>
+        </w:rPr>
+        <w:drawing>
+          <wp:inline distT="0" distB="0" distL="0" distR="0" wp14:anchorId="1D369BFA" wp14:editId="5AE2AD26">
+            <wp:extent cx="2589132" cy="2880000"/>
+            <wp:effectExtent l="0" t="0" r="1905" b="3175"/>
+            <wp:docPr id="532069692" name="Picture 33" descr="A graph with numbers and dots&#10;&#10;AI-generated content may be incorrect."/>
+            <wp:cNvGraphicFramePr>
+              <a:graphicFrameLocks xmlns:a="http://schemas.openxmlformats.org/drawingml/2006/main" noChangeAspect="1"/>
+            </wp:cNvGraphicFramePr>
+            <a:graphic xmlns:a="http://schemas.openxmlformats.org/drawingml/2006/main">
+              <a:graphicData uri="http://schemas.openxmlformats.org/drawingml/2006/picture">
+                <pic:pic xmlns:pic="http://schemas.openxmlformats.org/drawingml/2006/picture">
+                  <pic:nvPicPr>
+                    <pic:cNvPr id="532069692" name="Picture 33" descr="A graph with numbers and dots&#10;&#10;AI-generated content may be incorrect."/>
+                    <pic:cNvPicPr/>
+                  </pic:nvPicPr>
+                  <pic:blipFill>
+                    <a:blip r:embed="rId16" cstate="print">
+                      <a:extLst>
+                        <a:ext uri="{28A0092B-C50C-407E-A947-70E740481C1C}">
+                          <a14:useLocalDpi xmlns:a14="http://schemas.microsoft.com/office/drawing/2010/main" val="0"/>
+                        </a:ext>
+                      </a:extLst>
+                    </a:blip>
+                    <a:stretch>
+                      <a:fillRect/>
+                    </a:stretch>
+                  </pic:blipFill>
+                  <pic:spPr>
+                    <a:xfrm>
+                      <a:off x="0" y="0"/>
+                      <a:ext cx="2589132" cy="2880000"/>
+                    </a:xfrm>
+                    <a:prstGeom prst="rect">
+                      <a:avLst/>
+                    </a:prstGeom>
+                  </pic:spPr>
+                </pic:pic>
+              </a:graphicData>
+            </a:graphic>
+          </wp:inline>
+        </w:drawing>
+      </w:r>
+      <w:r>
+        <w:rPr>
+          <w:noProof/>
+          <w:lang w:val="en-US"/>
+        </w:rPr>
+        <w:drawing>
+          <wp:inline distT="0" distB="0" distL="0" distR="0" wp14:anchorId="630CF6D1" wp14:editId="26CEDB08">
+            <wp:extent cx="2589132" cy="2880000"/>
+            <wp:effectExtent l="0" t="0" r="1905" b="3175"/>
+            <wp:docPr id="323822138" name="Picture 34" descr="A graph of a graph with numbers and lines&#10;&#10;AI-generated content may be incorrect."/>
+            <wp:cNvGraphicFramePr>
+              <a:graphicFrameLocks xmlns:a="http://schemas.openxmlformats.org/drawingml/2006/main" noChangeAspect="1"/>
+            </wp:cNvGraphicFramePr>
+            <a:graphic xmlns:a="http://schemas.openxmlformats.org/drawingml/2006/main">
+              <a:graphicData uri="http://schemas.openxmlformats.org/drawingml/2006/picture">
+                <pic:pic xmlns:pic="http://schemas.openxmlformats.org/drawingml/2006/picture">
+                  <pic:nvPicPr>
+                    <pic:cNvPr id="323822138" name="Picture 34" descr="A graph of a graph with numbers and lines&#10;&#10;AI-generated content may be incorrect."/>
+                    <pic:cNvPicPr/>
+                  </pic:nvPicPr>
+                  <pic:blipFill>
+                    <a:blip r:embed="rId17" cstate="print">
+                      <a:extLst>
+                        <a:ext uri="{28A0092B-C50C-407E-A947-70E740481C1C}">
+                          <a14:useLocalDpi xmlns:a14="http://schemas.microsoft.com/office/drawing/2010/main" val="0"/>
+                        </a:ext>
+                      </a:extLst>
+                    </a:blip>
+                    <a:stretch>
+                      <a:fillRect/>
+                    </a:stretch>
+                  </pic:blipFill>
+                  <pic:spPr>
+                    <a:xfrm>
+                      <a:off x="0" y="0"/>
+                      <a:ext cx="2589132" cy="2880000"/>
+                    </a:xfrm>
+                    <a:prstGeom prst="rect">
+                      <a:avLst/>
+                    </a:prstGeom>
+                  </pic:spPr>
+                </pic:pic>
+              </a:graphicData>
+            </a:graphic>
+          </wp:inline>
+        </w:drawing>
+      </w:r>
+    </w:p>
+    <w:p>
+      <w:pPr>
+        <w:pStyle w:val="Heading3"/>
+        <w:rPr>
+          <w:lang w:val="en-US"/>
+        </w:rPr>
+      </w:pPr>
+      <w:r>
+        <w:rPr>
+          <w:lang w:val="en-US"/>
+        </w:rPr>
+        <w:lastRenderedPageBreak/>
+        <w:t>Healthcare seeking</w:t>
+      </w:r>
+    </w:p>
+    <w:p>
+      <w:pPr>
+        <w:pStyle w:val="Heading3"/>
+        <w:numPr>
+          <w:ilvl w:val="0"/>
+          <w:numId w:val="1"/>
+        </w:numPr>
+        <w:rPr>
+          <w:lang w:val="en-US"/>
+        </w:rPr>
+      </w:pPr>
+      <w:r>
+        <w:rPr>
+          <w:lang w:val="en-US"/>
+        </w:rPr>
+        <w:t>pSeek</w:t>
+      </w:r>
+    </w:p>
+    <w:p>
+      <w:pPr>
+        <w:rPr>
+          <w:lang w:val="en-US"/>
+        </w:rPr>
+      </w:pPr>
+      <w:r>
+        <w:rPr>
+          <w:lang w:val="en-US"/>
+        </w:rPr>
+        <w:drawing>
+          <wp:inline distT="0" distB="0" distL="0" distR="0" wp14:anchorId="775417F5" wp14:editId="5D2274D6">
+            <wp:extent cx="4235047" cy="5832000"/>
+            <wp:effectExtent l="0" t="0" r="0" b="0"/>
+            <wp:docPr id="275227626" name="Picture 1" descr="A group of graphs with numbers&#10;&#10;AI-generated content may be incorrect."/>
+            <wp:cNvGraphicFramePr>
+              <a:graphicFrameLocks xmlns:a="http://schemas.openxmlformats.org/drawingml/2006/main" noChangeAspect="1"/>
+            </wp:cNvGraphicFramePr>
+            <a:graphic xmlns:a="http://schemas.openxmlformats.org/drawingml/2006/main">
+              <a:graphicData uri="http://schemas.openxmlformats.org/drawingml/2006/picture">
+                <pic:pic xmlns:pic="http://schemas.openxmlformats.org/drawingml/2006/picture">
+                  <pic:nvPicPr>
+                    <pic:cNvPr id="275227626" name="Picture 1" descr="A group of graphs with numbers&#10;&#10;AI-generated content may be incorrect."/>
+                    <pic:cNvPicPr/>
+                  </pic:nvPicPr>
+                  <pic:blipFill>
+                    <a:blip r:embed="rId18"/>
+                    <a:stretch>
+                      <a:fillRect/>
+                    </a:stretch>
+                  </pic:blipFill>
+                  <pic:spPr>
+                    <a:xfrm>
+                      <a:off x="0" y="0"/>
+                      <a:ext cx="4235047" cy="5832000"/>
+                    </a:xfrm>
+                    <a:prstGeom prst="rect">
+                      <a:avLst/>
+                    </a:prstGeom>
+                  </pic:spPr>
+                </pic:pic>
+              </a:graphicData>
+            </a:graphic>
+          </wp:inline>
+        </w:drawing>
+      </w:r>
+    </w:p>
+    <w:p>
+      <w:pPr>
+        <w:pStyle w:val="Heading3"/>
+        <w:numPr>
+          <w:ilvl w:val="0"/>
+          <w:numId w:val="1"/>
+        </w:numPr>
+        <w:rPr>
+          <w:lang w:val="en-US"/>
+        </w:rPr>
+      </w:pPr>
+      <w:r>
+        <w:rPr>
+          <w:lang w:val="en-US"/>
+        </w:rPr>
+        <w:lastRenderedPageBreak/>
+        <w:t>pStart</w:t>
+      </w:r>
+    </w:p>
+    <w:p>
+      <w:pPr>
+        <w:rPr>
+          <w:lang w:val="en-US"/>
+        </w:rPr>
+      </w:pPr>
+      <w:r>
+        <w:rPr>
+          <w:noProof/>
+          <w:lang w:val="en-US"/>
+        </w:rPr>
+        <w:drawing>
+          <wp:inline distT="0" distB="0" distL="0" distR="0" wp14:anchorId="0D7200B5" wp14:editId="65DBE705">
+            <wp:extent cx="3979715" cy="5714462"/>
+            <wp:effectExtent l="0" t="0" r="0" b="635"/>
+            <wp:docPr id="1451325963" name="Picture 18"/>
+            <wp:cNvGraphicFramePr>
+              <a:graphicFrameLocks xmlns:a="http://schemas.openxmlformats.org/drawingml/2006/main" noChangeAspect="1"/>
+            </wp:cNvGraphicFramePr>
+            <a:graphic xmlns:a="http://schemas.openxmlformats.org/drawingml/2006/main">
+              <a:graphicData uri="http://schemas.openxmlformats.org/drawingml/2006/picture">
+                <pic:pic xmlns:pic="http://schemas.openxmlformats.org/drawingml/2006/picture">
+                  <pic:nvPicPr>
+                    <pic:cNvPr id="1451325963" name="Picture 18"/>
+                    <pic:cNvPicPr/>
+                  </pic:nvPicPr>
+                  <pic:blipFill>
+                    <a:blip r:embed="rId19" cstate="print">
+                      <a:extLst>
+                        <a:ext uri="{28A0092B-C50C-407E-A947-70E740481C1C}">
+                          <a14:useLocalDpi xmlns:a14="http://schemas.microsoft.com/office/drawing/2010/main" val="0"/>
+                        </a:ext>
+                      </a:extLst>
+                    </a:blip>
+                    <a:stretch>
+                      <a:fillRect/>
+                    </a:stretch>
+                  </pic:blipFill>
+                  <pic:spPr>
+                    <a:xfrm>
+                      <a:off x="0" y="0"/>
+                      <a:ext cx="3979715" cy="5714462"/>
+                    </a:xfrm>
+                    <a:prstGeom prst="rect">
+                      <a:avLst/>
+                    </a:prstGeom>
+                  </pic:spPr>
+                </pic:pic>
+              </a:graphicData>
+            </a:graphic>
+          </wp:inline>
+        </w:drawing>
+      </w:r>
+    </w:p>
+    <w:p>
+      <w:pPr>
+        <w:rPr>
+          <w:lang w:val="en-US"/>
+        </w:rPr>
+      </w:pPr>
+    </w:p>
+    <w:p>
+      <w:pPr>
+        <w:pStyle w:val="ListParagraph"/>
+        <w:numPr>
+          <w:ilvl w:val="0"/>
+          <w:numId w:val="1"/>
+        </w:numPr>
+        <w:rPr>
+          <w:rStyle w:val="Heading3Char"/>
+          <w:rFonts w:asciiTheme="minorHAnsi" w:eastAsiaTheme="minorHAnsi" w:hAnsiTheme="minorHAnsi" w:cstheme="minorBidi"/>
+          <w:color w:val="auto"/>
+          <w:lang w:val="en-US"/>
+        </w:rPr>
+      </w:pPr>
+      <w:r>
+        <w:rPr>
+          <w:rStyle w:val="Heading3Char"/>
+          <w:lang w:val="en-US"/>
+        </w:rPr>
+        <w:lastRenderedPageBreak/>
+        <w:t>pComplete</w:t>
+      </w:r>
+    </w:p>
+    <w:p>
+      <w:pPr>
+        <w:pStyle w:val="ListParagraph"/>
+        <w:rPr>
+          <w:lang w:val="en-US"/>
+        </w:rPr>
+      </w:pPr>
+      <w:r>
+        <w:rPr>
+          <w:lang w:val="en-US"/>
+        </w:rPr>
+        <w:br/>
+      </w:r>
+      <w:r>
+        <w:rPr>
+          <w:noProof/>
+          <w:lang w:val="en-US"/>
+        </w:rPr>
+        <w:drawing>
+          <wp:inline distT="0" distB="0" distL="0" distR="0" wp14:anchorId="6BFC0601" wp14:editId="0C604FA3">
+            <wp:extent cx="3886760" cy="5580988"/>
+            <wp:effectExtent l="0" t="0" r="0" b="0"/>
+            <wp:docPr id="398732872" name="Picture 20"/>
+            <wp:cNvGraphicFramePr>
+              <a:graphicFrameLocks xmlns:a="http://schemas.openxmlformats.org/drawingml/2006/main" noChangeAspect="1"/>
+            </wp:cNvGraphicFramePr>
+            <a:graphic xmlns:a="http://schemas.openxmlformats.org/drawingml/2006/main">
+              <a:graphicData uri="http://schemas.openxmlformats.org/drawingml/2006/picture">
+                <pic:pic xmlns:pic="http://schemas.openxmlformats.org/drawingml/2006/picture">
+                  <pic:nvPicPr>
+                    <pic:cNvPr id="398732872" name="Picture 20"/>
+                    <pic:cNvPicPr/>
+                  </pic:nvPicPr>
+                  <pic:blipFill>
+                    <a:blip r:embed="rId20" cstate="print">
+                      <a:extLst>
+                        <a:ext uri="{28A0092B-C50C-407E-A947-70E740481C1C}">
+                          <a14:useLocalDpi xmlns:a14="http://schemas.microsoft.com/office/drawing/2010/main" val="0"/>
+                        </a:ext>
+                      </a:extLst>
+                    </a:blip>
+                    <a:stretch>
+                      <a:fillRect/>
+                    </a:stretch>
+                  </pic:blipFill>
+                  <pic:spPr>
+                    <a:xfrm>
+                      <a:off x="0" y="0"/>
+                      <a:ext cx="3886760" cy="5580988"/>
+                    </a:xfrm>
+                    <a:prstGeom prst="rect">
+                      <a:avLst/>
+                    </a:prstGeom>
+                  </pic:spPr>
+                </pic:pic>
+              </a:graphicData>
+            </a:graphic>
+          </wp:inline>
+        </w:drawing>
+      </w:r>
+    </w:p>
     <w:sectPr>
       <w:pgSz w:w="15840" w:h="12240" w:orient="landscape"/>
       <w:pgMar w:top="1100" w:right="278" w:bottom="1298" w:left="1361" w:header="720" w:footer="720" w:gutter="0"/>
@@ -791,8 +1372,105 @@
 </w:document>
 </file>
 
+<file path=word/numbering.xml><?xml version="1.0" encoding="utf-8"?>
+<w:numbering xmlns:wpc="http://schemas.microsoft.com/office/word/2010/wordprocessingCanvas" xmlns:cx="http://schemas.microsoft.com/office/drawing/2014/chartex" xmlns:cx1="http://schemas.microsoft.com/office/drawing/2015/9/8/chartex" xmlns:cx2="http://schemas.microsoft.com/office/drawing/2015/10/21/chartex" xmlns:cx3="http://schemas.microsoft.com/office/drawing/2016/5/9/chartex" xmlns:cx4="http://schemas.microsoft.com/office/drawing/2016/5/10/chartex" xmlns:cx5="http://schemas.microsoft.com/office/drawing/2016/5/11/chartex" xmlns:cx6="http://schemas.microsoft.com/office/drawing/2016/5/12/chartex" xmlns:cx7="http://schemas.microsoft.com/office/drawing/2016/5/13/chartex" xmlns:cx8="http://schemas.microsoft.com/office/drawing/2016/5/14/chartex" xmlns:mc="http://schemas.openxmlformats.org/markup-compatibility/2006" xmlns:aink="http://schemas.microsoft.com/office/drawing/2016/ink" xmlns:am3d="http://schemas.microsoft.com/office/drawing/2017/model3d" xmlns:o="urn:schemas-microsoft-com:office:office" xmlns:oel="http://schemas.microsoft.com/office/2019/extlst" xmlns:r="http://schemas.openxmlformats.org/officeDocument/2006/relationships" xmlns:m="http://schemas.openxmlformats.org/officeDocument/2006/math" xmlns:v="urn:schemas-microsoft-com:vml" xmlns:wp14="http://schemas.microsoft.com/office/word/2010/wordprocessingDrawing" xmlns:wp="http://schemas.openxmlformats.org/drawingml/2006/wordprocessingDrawing" xmlns:w10="urn:schemas-microsoft-com:office:word" xmlns:w="http://schemas.openxmlformats.org/wordprocessingml/2006/main" xmlns:w14="http://schemas.microsoft.com/office/word/2010/wordml" xmlns:w15="http://schemas.microsoft.com/office/word/2012/wordml" xmlns:w16cex="http://schemas.microsoft.com/office/word/2018/wordml/cex" xmlns:w16cid="http://schemas.microsoft.com/office/word/2016/wordml/cid" xmlns:w16="http://schemas.microsoft.com/office/word/2018/wordml" xmlns:w16du="http://schemas.microsoft.com/office/word/2023/wordml/word16du" xmlns:w16sdtdh="http://schemas.microsoft.com/office/word/2020/wordml/sdtdatahash" xmlns:w16sdtfl="http://schemas.microsoft.com/office/word/2024/wordml/sdtformatlock" xmlns:w16se="http://schemas.microsoft.com/office/word/2015/wordml/symex" xmlns:wpg="http://schemas.microsoft.com/office/word/2010/wordprocessingGroup" xmlns:wpi="http://schemas.microsoft.com/office/word/2010/wordprocessingInk" xmlns:wne="http://schemas.microsoft.com/office/word/2006/wordml" xmlns:wps="http://schemas.microsoft.com/office/word/2010/wordprocessingShape" mc:Ignorable="w14 w15 w16se w16cid w16 w16cex w16sdtdh w16sdtfl w16du wp14">
+  <w:abstractNum w:abstractNumId="0" w15:restartNumberingAfterBreak="0">
+    <w:nsid w:val="12E21C9B"/>
+    <w:multiLevelType w:val="hybridMultilevel"/>
+    <w:tmpl w:val="1E32D376"/>
+    <w:lvl w:ilvl="0" w:tplc="0809000F">
+      <w:start w:val="1"/>
+      <w:numFmt w:val="decimal"/>
+      <w:lvlText w:val="%1."/>
+      <w:lvlJc w:val="left"/>
+      <w:pPr>
+        <w:ind w:left="720" w:hanging="360"/>
+      </w:pPr>
+      <w:rPr>
+        <w:rFonts w:hint="default"/>
+      </w:rPr>
+    </w:lvl>
+    <w:lvl w:ilvl="1" w:tplc="08090019" w:tentative="1">
+      <w:start w:val="1"/>
+      <w:numFmt w:val="lowerLetter"/>
+      <w:lvlText w:val="%2."/>
+      <w:lvlJc w:val="left"/>
+      <w:pPr>
+        <w:ind w:left="1440" w:hanging="360"/>
+      </w:pPr>
+    </w:lvl>
+    <w:lvl w:ilvl="2" w:tplc="0809001B" w:tentative="1">
+      <w:start w:val="1"/>
+      <w:numFmt w:val="lowerRoman"/>
+      <w:lvlText w:val="%3."/>
+      <w:lvlJc w:val="right"/>
+      <w:pPr>
+        <w:ind w:left="2160" w:hanging="180"/>
+      </w:pPr>
+    </w:lvl>
+    <w:lvl w:ilvl="3" w:tplc="0809000F" w:tentative="1">
+      <w:start w:val="1"/>
+      <w:numFmt w:val="decimal"/>
+      <w:lvlText w:val="%4."/>
+      <w:lvlJc w:val="left"/>
+      <w:pPr>
+        <w:ind w:left="2880" w:hanging="360"/>
+      </w:pPr>
+    </w:lvl>
+    <w:lvl w:ilvl="4" w:tplc="08090019" w:tentative="1">
+      <w:start w:val="1"/>
+      <w:numFmt w:val="lowerLetter"/>
+      <w:lvlText w:val="%5."/>
+      <w:lvlJc w:val="left"/>
+      <w:pPr>
+        <w:ind w:left="3600" w:hanging="360"/>
+      </w:pPr>
+    </w:lvl>
+    <w:lvl w:ilvl="5" w:tplc="0809001B" w:tentative="1">
+      <w:start w:val="1"/>
+      <w:numFmt w:val="lowerRoman"/>
+      <w:lvlText w:val="%6."/>
+      <w:lvlJc w:val="right"/>
+      <w:pPr>
+        <w:ind w:left="4320" w:hanging="180"/>
+      </w:pPr>
+    </w:lvl>
+    <w:lvl w:ilvl="6" w:tplc="0809000F" w:tentative="1">
+      <w:start w:val="1"/>
+      <w:numFmt w:val="decimal"/>
+      <w:lvlText w:val="%7."/>
+      <w:lvlJc w:val="left"/>
+      <w:pPr>
+        <w:ind w:left="5040" w:hanging="360"/>
+      </w:pPr>
+    </w:lvl>
+    <w:lvl w:ilvl="7" w:tplc="08090019" w:tentative="1">
+      <w:start w:val="1"/>
+      <w:numFmt w:val="lowerLetter"/>
+      <w:lvlText w:val="%8."/>
+      <w:lvlJc w:val="left"/>
+      <w:pPr>
+        <w:ind w:left="5760" w:hanging="360"/>
+      </w:pPr>
+    </w:lvl>
+    <w:lvl w:ilvl="8" w:tplc="0809001B" w:tentative="1">
+      <w:start w:val="1"/>
+      <w:numFmt w:val="lowerRoman"/>
+      <w:lvlText w:val="%9."/>
+      <w:lvlJc w:val="right"/>
+      <w:pPr>
+        <w:ind w:left="6480" w:hanging="180"/>
+      </w:pPr>
+    </w:lvl>
+  </w:abstractNum>
+  <w:num w:numId="1" w16cid:durableId="17314472">
+    <w:abstractNumId w:val="0"/>
+  </w:num>
+</w:numbering>
+</file>
+
 <file path=word/styles.xml><?xml version="1.0" encoding="utf-8"?>
-<w:styles xmlns:mc="http://schemas.openxmlformats.org/markup-compatibility/2006" xmlns:r="http://schemas.openxmlformats.org/officeDocument/2006/relationships" xmlns:w="http://schemas.openxmlformats.org/wordprocessingml/2006/main" xmlns:w14="http://schemas.microsoft.com/office/word/2010/wordml" xmlns:w15="http://schemas.microsoft.com/office/word/2012/wordml" xmlns:w16cex="http://schemas.microsoft.com/office/word/2018/wordml/cex" xmlns:w16cid="http://schemas.microsoft.com/office/word/2016/wordml/cid" xmlns:w16="http://schemas.microsoft.com/office/word/2018/wordml" xmlns:w16sdtdh="http://schemas.microsoft.com/office/word/2020/wordml/sdtdatahash" xmlns:w16se="http://schemas.microsoft.com/office/word/2015/wordml/symex" mc:Ignorable="w14 w15 w16se w16cid w16 w16cex w16sdtdh">
+<w:styles xmlns:mc="http://schemas.openxmlformats.org/markup-compatibility/2006" xmlns:r="http://schemas.openxmlformats.org/officeDocument/2006/relationships" xmlns:w="http://schemas.openxmlformats.org/wordprocessingml/2006/main" xmlns:w14="http://schemas.microsoft.com/office/word/2010/wordml" xmlns:w15="http://schemas.microsoft.com/office/word/2012/wordml" xmlns:w16cex="http://schemas.microsoft.com/office/word/2018/wordml/cex" xmlns:w16cid="http://schemas.microsoft.com/office/word/2016/wordml/cid" xmlns:w16="http://schemas.microsoft.com/office/word/2018/wordml" xmlns:w16du="http://schemas.microsoft.com/office/word/2023/wordml/word16du" xmlns:w16sdtdh="http://schemas.microsoft.com/office/word/2020/wordml/sdtdatahash" xmlns:w16sdtfl="http://schemas.microsoft.com/office/word/2024/wordml/sdtformatlock" xmlns:w16se="http://schemas.microsoft.com/office/word/2015/wordml/symex" mc:Ignorable="w14 w15 w16se w16cid w16 w16cex w16sdtdh w16sdtfl w16du">
   <w:docDefaults>
     <w:rPrDefault>
       <w:rPr>
@@ -1188,6 +1866,27 @@
     <w:name w:val="Normal"/>
     <w:qFormat/>
   </w:style>
+  <w:style w:type="paragraph" w:styleId="Heading1">
+    <w:name w:val="heading 1"/>
+    <w:basedOn w:val="Normal"/>
+    <w:next w:val="Normal"/>
+    <w:link w:val="Heading1Char"/>
+    <w:uiPriority w:val="9"/>
+    <w:qFormat/>
+    <w:rsid w:val="00535FA9"/>
+    <w:pPr>
+      <w:keepNext/>
+      <w:keepLines/>
+      <w:spacing w:before="240"/>
+      <w:outlineLvl w:val="0"/>
+    </w:pPr>
+    <w:rPr>
+      <w:rFonts w:asciiTheme="majorHAnsi" w:eastAsiaTheme="majorEastAsia" w:hAnsiTheme="majorHAnsi" w:cstheme="majorBidi"/>
+      <w:color w:val="2F5496" w:themeColor="accent1" w:themeShade="BF"/>
+      <w:sz w:val="32"/>
+      <w:szCs w:val="32"/>
+    </w:rPr>
+  </w:style>
   <w:style w:type="paragraph" w:styleId="Heading2">
     <w:name w:val="heading 2"/>
     <w:basedOn w:val="Normal"/>
@@ -1208,6 +1907,26 @@
       <w:szCs w:val="36"/>
       <w:lang w:eastAsia="en-GB"/>
       <w14:ligatures w14:val="none"/>
+    </w:rPr>
+  </w:style>
+  <w:style w:type="paragraph" w:styleId="Heading3">
+    <w:name w:val="heading 3"/>
+    <w:basedOn w:val="Normal"/>
+    <w:next w:val="Normal"/>
+    <w:link w:val="Heading3Char"/>
+    <w:uiPriority w:val="9"/>
+    <w:unhideWhenUsed/>
+    <w:qFormat/>
+    <w:rsid w:val="003773B1"/>
+    <w:pPr>
+      <w:keepNext/>
+      <w:keepLines/>
+      <w:spacing w:before="40"/>
+      <w:outlineLvl w:val="2"/>
+    </w:pPr>
+    <w:rPr>
+      <w:rFonts w:asciiTheme="majorHAnsi" w:eastAsiaTheme="majorEastAsia" w:hAnsiTheme="majorHAnsi" w:cstheme="majorBidi"/>
+      <w:color w:val="1F3763" w:themeColor="accent1" w:themeShade="7F"/>
     </w:rPr>
   </w:style>
   <w:style w:type="character" w:default="1" w:styleId="DefaultParagraphFont">
@@ -1258,7 +1977,6 @@
     <w:name w:val="Normal (Web)"/>
     <w:basedOn w:val="Normal"/>
     <w:uiPriority w:val="99"/>
-    <w:semiHidden/>
     <w:unhideWhenUsed/>
     <w:rsid w:val="00B628B6"/>
     <w:pPr>
@@ -1269,6 +1987,52 @@
       <w:kern w:val="0"/>
       <w:lang w:eastAsia="en-GB"/>
       <w14:ligatures w14:val="none"/>
+    </w:rPr>
+  </w:style>
+  <w:style w:type="character" w:styleId="Strong">
+    <w:name w:val="Strong"/>
+    <w:basedOn w:val="DefaultParagraphFont"/>
+    <w:uiPriority w:val="22"/>
+    <w:qFormat/>
+    <w:rsid w:val="00535FA9"/>
+    <w:rPr>
+      <w:b/>
+      <w:bCs/>
+    </w:rPr>
+  </w:style>
+  <w:style w:type="character" w:customStyle="1" w:styleId="Heading1Char">
+    <w:name w:val="Heading 1 Char"/>
+    <w:basedOn w:val="DefaultParagraphFont"/>
+    <w:link w:val="Heading1"/>
+    <w:uiPriority w:val="9"/>
+    <w:rsid w:val="00535FA9"/>
+    <w:rPr>
+      <w:rFonts w:asciiTheme="majorHAnsi" w:eastAsiaTheme="majorEastAsia" w:hAnsiTheme="majorHAnsi" w:cstheme="majorBidi"/>
+      <w:color w:val="2F5496" w:themeColor="accent1" w:themeShade="BF"/>
+      <w:sz w:val="32"/>
+      <w:szCs w:val="32"/>
+    </w:rPr>
+  </w:style>
+  <w:style w:type="paragraph" w:styleId="ListParagraph">
+    <w:name w:val="List Paragraph"/>
+    <w:basedOn w:val="Normal"/>
+    <w:uiPriority w:val="34"/>
+    <w:qFormat/>
+    <w:rsid w:val="003773B1"/>
+    <w:pPr>
+      <w:ind w:left="720"/>
+      <w:contextualSpacing/>
+    </w:pPr>
+  </w:style>
+  <w:style w:type="character" w:customStyle="1" w:styleId="Heading3Char">
+    <w:name w:val="Heading 3 Char"/>
+    <w:basedOn w:val="DefaultParagraphFont"/>
+    <w:link w:val="Heading3"/>
+    <w:uiPriority w:val="9"/>
+    <w:rsid w:val="003773B1"/>
+    <w:rPr>
+      <w:rFonts w:asciiTheme="majorHAnsi" w:eastAsiaTheme="majorEastAsia" w:hAnsiTheme="majorHAnsi" w:cstheme="majorBidi"/>
+      <w:color w:val="1F3763" w:themeColor="accent1" w:themeShade="7F"/>
     </w:rPr>
   </w:style>
 </w:styles>

</xml_diff>